<commit_message>
it lloks better now
</commit_message>
<xml_diff>
--- a/T2/Javier_munoz_T2_energymarkets.doc.docx
+++ b/T2/Javier_munoz_T2_energymarkets.doc.docx
@@ -4,42 +4,26 @@
   <w:body>
     <w:p>
       <w:pPr>
-        <w:pStyle w:val="papertitle"/>
-        <w:rPr>
-          <w:rFonts w:eastAsia="MS Mincho"/>
-          <w:b/>
-          <w:bCs w:val="0"/>
-        </w:rPr>
-      </w:pPr>
-      <w:r>
-        <w:rPr>
-          <w:b/>
-          <w:bCs w:val="0"/>
-        </w:rPr>
+        <w:pStyle w:val="Title"/>
+        <w:rPr>
+          <w:rFonts w:eastAsia="MS Mincho"/>
+        </w:rPr>
+      </w:pPr>
+      <w:r>
         <w:t>Analysis of the effect in the electricity market equilibrium of a wind-power plant</w:t>
       </w:r>
       <w:r>
         <w:rPr>
           <w:rFonts w:eastAsia="MS Mincho"/>
-          <w:b/>
-          <w:bCs w:val="0"/>
         </w:rPr>
         <w:t xml:space="preserve"> </w:t>
       </w:r>
     </w:p>
     <w:p>
       <w:pPr>
-        <w:rPr>
-          <w:rFonts w:eastAsia="MS Mincho"/>
-          <w:b/>
-          <w:bCs/>
-        </w:rPr>
-      </w:pPr>
-      <w:r>
-        <w:rPr>
-          <w:b/>
-          <w:bCs/>
-        </w:rPr>
+        <w:pStyle w:val="Subtitle"/>
+      </w:pPr>
+      <w:r>
         <w:t>Energy Markets - 2on Laboratory Assignment</w:t>
       </w:r>
     </w:p>
@@ -62,20 +46,17 @@
         <w:pStyle w:val="Author"/>
         <w:rPr>
           <w:rFonts w:eastAsia="MS Mincho"/>
-          <w:lang w:val="es-ES"/>
-        </w:rPr>
-      </w:pPr>
-      <w:r>
-        <w:rPr>
-          <w:rFonts w:eastAsia="MS Mincho"/>
-          <w:lang w:val="es-ES"/>
+        </w:rPr>
+      </w:pPr>
+      <w:r>
+        <w:rPr>
+          <w:rFonts w:eastAsia="MS Mincho"/>
         </w:rPr>
         <w:t>Javier Muñoz Sáez</w:t>
       </w:r>
       <w:r>
         <w:rPr>
           <w:rFonts w:eastAsia="MS Mincho"/>
-          <w:lang w:val="es-ES"/>
         </w:rPr>
         <w:t xml:space="preserve"> (</w:t>
       </w:r>
@@ -83,14 +64,12 @@
         <w:rPr>
           <w:rFonts w:eastAsia="MS Mincho"/>
           <w:i/>
-          <w:lang w:val="es-ES"/>
         </w:rPr>
         <w:t>Author</w:t>
       </w:r>
       <w:r>
         <w:rPr>
           <w:rFonts w:eastAsia="MS Mincho"/>
-          <w:lang w:val="es-ES"/>
         </w:rPr>
         <w:t>)</w:t>
       </w:r>
@@ -145,18 +124,9 @@
         </w:rPr>
       </w:pPr>
     </w:p>
-    <w:p>
-      <w:pPr>
-        <w:rPr>
-          <w:rFonts w:eastAsia="MS Mincho"/>
-        </w:rPr>
-      </w:pPr>
-    </w:p>
-    <w:p>
-      <w:pPr>
-        <w:rPr>
-          <w:rFonts w:eastAsia="MS Mincho"/>
-        </w:rPr>
+    <w:p/>
+    <w:p>
+      <w:pPr>
         <w:sectPr>
           <w:type w:val="continuous"/>
           <w:pgSz w:w="11909" w:h="16834" w:code="9"/>
@@ -188,128 +158,1221 @@
         <w:t>—</w:t>
       </w:r>
       <w:r>
-        <w:t>This electronic document is a “live</w:t>
-      </w:r>
-      <w:r>
-        <w:t>”</w:t>
-      </w:r>
-      <w:r>
-        <w:t xml:space="preserve"> template and already defines the components of your paper [title, text, heads, etc.] in its style sheet.  </w:t>
-      </w:r>
-      <w:r>
-        <w:rPr>
-          <w:i/>
-          <w:color w:val="FF0000"/>
-        </w:rPr>
-        <w:t>*</w:t>
-      </w:r>
-      <w:r>
-        <w:rPr>
-          <w:i/>
-          <w:color w:val="FF0000"/>
-        </w:rPr>
-        <w:t>CRITICAL:  Do Not Use Symbols, Special Characters, or Math in Paper Title or Abstract</w:t>
-      </w:r>
-      <w:r>
-        <w:rPr>
-          <w:rFonts w:eastAsia="MS Mincho"/>
-          <w:color w:val="FF0000"/>
-        </w:rPr>
+        <w:t xml:space="preserve">This report presents a study of a small energy distribution-generation-consumption network and examines the impact </w:t>
+      </w:r>
+      <w:r>
+        <w:t xml:space="preserve">in market clearing and power flow </w:t>
+      </w:r>
+      <w:r>
+        <w:t xml:space="preserve">of adding a wind </w:t>
+      </w:r>
+      <w:r>
+        <w:t>power plant</w:t>
+      </w:r>
+      <w:r>
+        <w:t xml:space="preserve">. GAMS (General Algebraic Modeling System) </w:t>
+      </w:r>
+      <w:r>
+        <w:t>is</w:t>
+      </w:r>
+      <w:r>
+        <w:t xml:space="preserve"> used to find the market equilibrium for both scenarios.</w:t>
+      </w:r>
+    </w:p>
+    <w:p>
+      <w:pPr>
+        <w:pStyle w:val="keywords"/>
+      </w:pPr>
+      <w:r>
+        <w:rPr>
+          <w:rFonts w:eastAsia="MS Mincho"/>
+        </w:rPr>
+        <w:t>Keywords</w:t>
+      </w:r>
+      <w:r>
+        <w:rPr>
+          <w:rFonts w:eastAsia="MS Mincho"/>
+        </w:rPr>
+        <w:t xml:space="preserve">: </w:t>
+      </w:r>
+      <w:r>
+        <w:t xml:space="preserve">Energy Distribution; Energy Generation; Energy Consumption; Wind </w:t>
+      </w:r>
+      <w:r>
+        <w:t>Power Plant</w:t>
+      </w:r>
+      <w:r>
+        <w:t xml:space="preserve"> Integration; Market Equilibrium; Day-Ahead Market; Renewable Energy; GAMS</w:t>
+      </w:r>
+      <w:r>
+        <w:t xml:space="preserve">; </w:t>
+      </w:r>
+      <w:r>
+        <w:t>Electricity Market Analysis</w:t>
+      </w:r>
+      <w:r>
+        <w:t>; TCMA.</w:t>
+      </w:r>
+    </w:p>
+    <w:p>
+      <w:pPr>
+        <w:pStyle w:val="keywords"/>
+        <w:rPr>
+          <w:rFonts w:eastAsia="MS Mincho"/>
+        </w:rPr>
+      </w:pPr>
+    </w:p>
+    <w:p>
+      <w:pPr>
+        <w:pStyle w:val="Heading1"/>
+      </w:pPr>
+      <w:r>
+        <w:t xml:space="preserve"> Introduction </w:t>
+      </w:r>
+    </w:p>
+    <w:p>
+      <w:r>
+        <w:t xml:space="preserve">A </w:t>
+      </w:r>
+      <w:r>
+        <w:t>simplified representation of the day-ahead electricity market of a fictitious country is used to analyze the optimization problem, modeling it as a TC</w:t>
+      </w:r>
+      <w:r>
+        <w:t>MA</w:t>
+      </w:r>
+      <w:r>
+        <w:t xml:space="preserve"> (Transmission Constrained Multi-Period Auction Model).</w:t>
+      </w:r>
+    </w:p>
+    <w:p>
+      <w:r>
+        <w:t>The proposed fictitious market has 4 buses, 3 Demand points, 5 Generation points and 5 power lines is organized as seen in Fig 1.</w:t>
+      </w:r>
+    </w:p>
+    <w:p>
+      <w:r>
+        <w:rPr>
+          <w:noProof/>
+        </w:rPr>
+        <w:drawing>
+          <wp:inline distT="0" distB="0" distL="0" distR="0" wp14:anchorId="1F20ED51" wp14:editId="4D3CEC74">
+            <wp:extent cx="2824843" cy="1950487"/>
+            <wp:effectExtent l="0" t="0" r="0" b="0"/>
+            <wp:docPr id="4" name="Picture 4"/>
+            <wp:cNvGraphicFramePr>
+              <a:graphicFrameLocks xmlns:a="http://schemas.openxmlformats.org/drawingml/2006/main" noChangeAspect="1"/>
+            </wp:cNvGraphicFramePr>
+            <a:graphic xmlns:a="http://schemas.openxmlformats.org/drawingml/2006/main">
+              <a:graphicData uri="http://schemas.openxmlformats.org/drawingml/2006/picture">
+                <pic:pic xmlns:pic="http://schemas.openxmlformats.org/drawingml/2006/picture">
+                  <pic:nvPicPr>
+                    <pic:cNvPr id="0" name="Picture 3"/>
+                    <pic:cNvPicPr>
+                      <a:picLocks noChangeAspect="1" noChangeArrowheads="1"/>
+                    </pic:cNvPicPr>
+                  </pic:nvPicPr>
+                  <pic:blipFill>
+                    <a:blip r:embed="rId6">
+                      <a:extLst>
+                        <a:ext uri="{28A0092B-C50C-407E-A947-70E740481C1C}">
+                          <a14:useLocalDpi xmlns:a14="http://schemas.microsoft.com/office/drawing/2010/main" val="0"/>
+                        </a:ext>
+                      </a:extLst>
+                    </a:blip>
+                    <a:srcRect/>
+                    <a:stretch>
+                      <a:fillRect/>
+                    </a:stretch>
+                  </pic:blipFill>
+                  <pic:spPr bwMode="auto">
+                    <a:xfrm>
+                      <a:off x="0" y="0"/>
+                      <a:ext cx="2829894" cy="1953975"/>
+                    </a:xfrm>
+                    <a:prstGeom prst="rect">
+                      <a:avLst/>
+                    </a:prstGeom>
+                    <a:noFill/>
+                    <a:ln>
+                      <a:noFill/>
+                    </a:ln>
+                  </pic:spPr>
+                </pic:pic>
+              </a:graphicData>
+            </a:graphic>
+          </wp:inline>
+        </w:drawing>
+      </w:r>
+    </w:p>
+    <w:p>
+      <w:pPr>
+        <w:pStyle w:val="Caption"/>
+      </w:pPr>
+      <w:r>
+        <w:t xml:space="preserve">Fig </w:t>
+      </w:r>
+      <w:r>
+        <w:fldChar w:fldCharType="begin"/>
+      </w:r>
+      <w:r>
+        <w:instrText xml:space="preserve"> SEQ Figure \* ARABIC </w:instrText>
+      </w:r>
+      <w:r>
+        <w:fldChar w:fldCharType="separate"/>
+      </w:r>
+      <w:r>
+        <w:rPr>
+          <w:noProof/>
+        </w:rPr>
+        <w:t>1</w:t>
+      </w:r>
+      <w:r>
+        <w:fldChar w:fldCharType="end"/>
+      </w:r>
+      <w:r>
+        <w:t>. Single line diagram of the studied network (WPP in blue)</w:t>
+      </w:r>
+    </w:p>
+    <w:p>
+      <w:r>
+        <w:t xml:space="preserve">The special case in which an extra WPP is added in the bus3 is highlighted in blue. </w:t>
+      </w:r>
+    </w:p>
+    <w:p/>
+    <w:p>
+      <w:pPr>
+        <w:pStyle w:val="Heading2"/>
+      </w:pPr>
+      <w:r>
+        <w:t xml:space="preserve">Objectives of the study </w:t>
+      </w:r>
+    </w:p>
+    <w:p>
+      <w:r>
+        <w:t>The goal is to find the equilibrium points of the base case, which is the system without the wind power plant (WPP). After that, the WPP will be introduced at bus 3, and the equilibrium points identified by GAMS for both scenarios will be compared.</w:t>
+      </w:r>
+    </w:p>
+    <w:p>
+      <w:r>
+        <w:t xml:space="preserve"> The key parameters for this comparison will be nodal prices, traded energy at each bus and time period, aggregated generation and demand functions, powerline congestions, economic transactions of producers and consumers, and merchandising surplus.</w:t>
+      </w:r>
+    </w:p>
+    <w:p/>
+    <w:p>
+      <w:pPr>
+        <w:pStyle w:val="Heading2"/>
+      </w:pPr>
+      <w:r>
+        <w:t>Structure of the report</w:t>
+      </w:r>
+    </w:p>
+    <w:p>
+      <w:r>
+        <w:t>The report begins with a description of both mode</w:t>
+      </w:r>
+      <w:r>
+        <w:t>l’s characteristics</w:t>
+      </w:r>
+      <w:r>
+        <w:t>, with and without the WPP (</w:t>
+      </w:r>
+      <w:r>
+        <w:t>Single-line diagram</w:t>
+      </w:r>
+      <w:r>
+        <w:t>).</w:t>
+      </w:r>
+    </w:p>
+    <w:p>
+      <w:r>
+        <w:t xml:space="preserve"> Next, </w:t>
+      </w:r>
+      <w:r>
+        <w:t>point II</w:t>
+      </w:r>
+      <w:r>
+        <w:t xml:space="preserve"> explains in detail </w:t>
+      </w:r>
+      <w:r>
+        <w:t xml:space="preserve">the data and </w:t>
+      </w:r>
+      <w:r>
+        <w:t xml:space="preserve">how is translated into the TCMA mathematical model. </w:t>
+      </w:r>
+    </w:p>
+    <w:p>
+      <w:r>
+        <w:t xml:space="preserve">Following </w:t>
+      </w:r>
+      <w:r>
+        <w:t xml:space="preserve">with </w:t>
+      </w:r>
+      <w:r>
+        <w:t>point II</w:t>
+      </w:r>
+      <w:r>
+        <w:t>I</w:t>
+      </w:r>
+      <w:r>
+        <w:t xml:space="preserve">, the results obtained by GAMS are presented. A MATLAB script is used to visualize the different market clearings for each bus and each time period. </w:t>
+      </w:r>
+    </w:p>
+    <w:p>
+      <w:r>
+        <w:t xml:space="preserve">Finally, the report </w:t>
+      </w:r>
+      <w:r>
+        <w:t>ends with IV</w:t>
+      </w:r>
+      <w:r>
+        <w:t xml:space="preserve"> with brief conclusions and references.</w:t>
+      </w:r>
+    </w:p>
+    <w:p/>
+    <w:p>
+      <w:pPr>
+        <w:pStyle w:val="Heading1"/>
+      </w:pPr>
+      <w:r>
+        <w:t>DEscription of the problem and mathematical model</w:t>
+      </w:r>
+    </w:p>
+    <w:p>
+      <w:pPr>
+        <w:pStyle w:val="Heading2"/>
+      </w:pPr>
+      <w:r>
+        <w:t>Presenting  model characteristics</w:t>
+      </w:r>
+    </w:p>
+    <w:p>
+      <w:r>
+        <w:t xml:space="preserve">All 5 Generation units are modeled following the data provided in Table1. Each Generator offers two different blocks (indexed as k) with its corresponding power in MW and price in €/Mwh. Limitations such as maximum/minimum powers and ramp up/down parameters are also </w:t>
+      </w:r>
+      <w:r>
+        <w:t>provided;</w:t>
+      </w:r>
+      <w:r>
+        <w:t xml:space="preserve"> those define real market constraints.</w:t>
+      </w:r>
+    </w:p>
+    <w:p>
+      <w:pPr>
+        <w:pStyle w:val="Caption"/>
+        <w:keepNext/>
+        <w:jc w:val="center"/>
+      </w:pPr>
+      <w:r>
+        <w:lastRenderedPageBreak/>
+        <w:t xml:space="preserve">Table </w:t>
+      </w:r>
+      <w:r>
+        <w:fldChar w:fldCharType="begin"/>
+      </w:r>
+      <w:r>
+        <w:instrText xml:space="preserve"> SEQ Table \* ARABIC </w:instrText>
+      </w:r>
+      <w:r>
+        <w:fldChar w:fldCharType="separate"/>
+      </w:r>
+      <w:r>
+        <w:rPr>
+          <w:noProof/>
+        </w:rPr>
+        <w:t>1</w:t>
+      </w:r>
+      <w:r>
+        <w:fldChar w:fldCharType="end"/>
+      </w:r>
+      <w:r>
+        <w:t xml:space="preserve">, </w:t>
+      </w:r>
+      <w:r>
+        <w:t>Base Model – Producers Characteristics</w:t>
+      </w:r>
+    </w:p>
+    <w:p>
+      <w:pPr>
+        <w:jc w:val="center"/>
+      </w:pPr>
+      <w:r>
+        <w:rPr>
+          <w:noProof/>
+        </w:rPr>
+        <w:drawing>
+          <wp:inline distT="0" distB="0" distL="0" distR="0" wp14:anchorId="5886F8B3" wp14:editId="3082EAF2">
+            <wp:extent cx="2901043" cy="916937"/>
+            <wp:effectExtent l="0" t="0" r="0" b="0"/>
+            <wp:docPr id="5" name="Picture 5"/>
+            <wp:cNvGraphicFramePr>
+              <a:graphicFrameLocks xmlns:a="http://schemas.openxmlformats.org/drawingml/2006/main" noChangeAspect="1"/>
+            </wp:cNvGraphicFramePr>
+            <a:graphic xmlns:a="http://schemas.openxmlformats.org/drawingml/2006/main">
+              <a:graphicData uri="http://schemas.openxmlformats.org/drawingml/2006/picture">
+                <pic:pic xmlns:pic="http://schemas.openxmlformats.org/drawingml/2006/picture">
+                  <pic:nvPicPr>
+                    <pic:cNvPr id="0" name="Imagen 1"/>
+                    <pic:cNvPicPr>
+                      <a:picLocks noChangeAspect="1" noChangeArrowheads="1"/>
+                    </pic:cNvPicPr>
+                  </pic:nvPicPr>
+                  <pic:blipFill>
+                    <a:blip r:embed="rId7" cstate="print">
+                      <a:extLst>
+                        <a:ext uri="{28A0092B-C50C-407E-A947-70E740481C1C}">
+                          <a14:useLocalDpi xmlns:a14="http://schemas.microsoft.com/office/drawing/2010/main" val="0"/>
+                        </a:ext>
+                      </a:extLst>
+                    </a:blip>
+                    <a:srcRect/>
+                    <a:stretch>
+                      <a:fillRect/>
+                    </a:stretch>
+                  </pic:blipFill>
+                  <pic:spPr bwMode="auto">
+                    <a:xfrm>
+                      <a:off x="0" y="0"/>
+                      <a:ext cx="2912672" cy="920613"/>
+                    </a:xfrm>
+                    <a:prstGeom prst="rect">
+                      <a:avLst/>
+                    </a:prstGeom>
+                    <a:noFill/>
+                    <a:ln>
+                      <a:noFill/>
+                    </a:ln>
+                  </pic:spPr>
+                </pic:pic>
+              </a:graphicData>
+            </a:graphic>
+          </wp:inline>
+        </w:drawing>
+      </w:r>
+    </w:p>
+    <w:p>
+      <w:pPr>
+        <w:ind w:firstLine="0"/>
+      </w:pPr>
+    </w:p>
+    <w:p>
+      <w:pPr>
+        <w:ind w:firstLine="0"/>
+      </w:pPr>
+      <w:r>
+        <w:tab/>
+        <w:t>The extra WPP (wind power plant) characteristics is modeled following the data in Table2. This new power plant offers its limited energy (in comparison to the other generation plants) at 0 €/MWh</w:t>
+      </w:r>
+      <w:r>
+        <w:t>, this 0 price makes its power very attractive and its included first in every auction</w:t>
+      </w:r>
+      <w:r>
         <w:t xml:space="preserve">. </w:t>
       </w:r>
       <w:r>
-        <w:rPr>
-          <w:rFonts w:eastAsia="MS Mincho"/>
-        </w:rPr>
-        <w:t>(</w:t>
-      </w:r>
-      <w:r>
-        <w:rPr>
-          <w:rFonts w:eastAsia="MS Mincho"/>
-          <w:b w:val="0"/>
-          <w:i/>
-        </w:rPr>
-        <w:t>Abstract</w:t>
-      </w:r>
-      <w:r>
-        <w:rPr>
-          <w:rFonts w:eastAsia="MS Mincho"/>
-        </w:rPr>
-        <w:t>)</w:t>
-      </w:r>
-    </w:p>
-    <w:p>
-      <w:pPr>
-        <w:pStyle w:val="keywords"/>
-        <w:rPr>
-          <w:rFonts w:eastAsia="MS Mincho"/>
-        </w:rPr>
-      </w:pPr>
-      <w:r>
-        <w:rPr>
-          <w:rFonts w:eastAsia="MS Mincho"/>
-        </w:rPr>
-        <w:t>Keywords—</w:t>
-      </w:r>
-      <w:r>
-        <w:rPr>
-          <w:rFonts w:eastAsia="MS Mincho"/>
-        </w:rPr>
-        <w:t>component; formatting; style; styling; insert (key words)</w:t>
+        <w:t>It does not have maximum or minimum power constraints, nor is it limited by any ramp-up or ramp-down limits.</w:t>
+      </w:r>
+    </w:p>
+    <w:p>
+      <w:pPr>
+        <w:pStyle w:val="Caption"/>
+        <w:keepNext/>
+        <w:jc w:val="center"/>
+      </w:pPr>
+      <w:r>
+        <w:t xml:space="preserve">Table </w:t>
+      </w:r>
+      <w:r>
+        <w:fldChar w:fldCharType="begin"/>
+      </w:r>
+      <w:r>
+        <w:instrText xml:space="preserve"> SEQ Table \* ARABIC </w:instrText>
+      </w:r>
+      <w:r>
+        <w:fldChar w:fldCharType="separate"/>
+      </w:r>
+      <w:r>
+        <w:rPr>
+          <w:noProof/>
+        </w:rPr>
+        <w:t>2</w:t>
+      </w:r>
+      <w:r>
+        <w:fldChar w:fldCharType="end"/>
+      </w:r>
+      <w:r>
+        <w:t>, Generator 6, Windpower plant characteristics</w:t>
+      </w:r>
+    </w:p>
+    <w:p>
+      <w:pPr>
+        <w:jc w:val="center"/>
+      </w:pPr>
+      <w:r>
+        <w:drawing>
+          <wp:inline distT="0" distB="0" distL="0" distR="0" wp14:anchorId="0A24F65A" wp14:editId="470B8D59">
+            <wp:extent cx="2378529" cy="369636"/>
+            <wp:effectExtent l="0" t="0" r="3175" b="0"/>
+            <wp:docPr id="1" name="Picture 1"/>
+            <wp:cNvGraphicFramePr>
+              <a:graphicFrameLocks xmlns:a="http://schemas.openxmlformats.org/drawingml/2006/main" noChangeAspect="1"/>
+            </wp:cNvGraphicFramePr>
+            <a:graphic xmlns:a="http://schemas.openxmlformats.org/drawingml/2006/main">
+              <a:graphicData uri="http://schemas.openxmlformats.org/drawingml/2006/picture">
+                <pic:pic xmlns:pic="http://schemas.openxmlformats.org/drawingml/2006/picture">
+                  <pic:nvPicPr>
+                    <pic:cNvPr id="1" name=""/>
+                    <pic:cNvPicPr/>
+                  </pic:nvPicPr>
+                  <pic:blipFill>
+                    <a:blip r:embed="rId8"/>
+                    <a:stretch>
+                      <a:fillRect/>
+                    </a:stretch>
+                  </pic:blipFill>
+                  <pic:spPr>
+                    <a:xfrm>
+                      <a:off x="0" y="0"/>
+                      <a:ext cx="2417694" cy="375723"/>
+                    </a:xfrm>
+                    <a:prstGeom prst="rect">
+                      <a:avLst/>
+                    </a:prstGeom>
+                  </pic:spPr>
+                </pic:pic>
+              </a:graphicData>
+            </a:graphic>
+          </wp:inline>
+        </w:drawing>
+      </w:r>
+    </w:p>
+    <w:p/>
+    <w:p>
+      <w:r>
+        <w:t>The three demand points D1, D2, D3 (indexed by i) will be modeled using the parameters from Table 3. Similar to the generators in Table 1, these also offer multiple demand blocks, in this case three (indexed by k), each with its power in MW and associated price in €/MWh.</w:t>
+      </w:r>
+    </w:p>
+    <w:p>
+      <w:pPr>
+        <w:pStyle w:val="Caption"/>
+        <w:keepNext/>
+        <w:jc w:val="center"/>
+      </w:pPr>
+      <w:r>
+        <w:t xml:space="preserve">Table </w:t>
+      </w:r>
+      <w:r>
+        <w:fldChar w:fldCharType="begin"/>
+      </w:r>
+      <w:r>
+        <w:instrText xml:space="preserve"> SEQ Table \* ARABIC </w:instrText>
+      </w:r>
+      <w:r>
+        <w:fldChar w:fldCharType="separate"/>
+      </w:r>
+      <w:r>
+        <w:rPr>
+          <w:noProof/>
+        </w:rPr>
+        <w:t>3</w:t>
+      </w:r>
+      <w:r>
+        <w:fldChar w:fldCharType="end"/>
+      </w:r>
+      <w:r>
+        <w:t>,</w:t>
+      </w:r>
+      <w:r>
+        <w:t xml:space="preserve"> </w:t>
+      </w:r>
+      <w:r>
+        <w:t>Consumers</w:t>
+      </w:r>
+      <w:r>
+        <w:t xml:space="preserve"> Characteristics</w:t>
+      </w:r>
+    </w:p>
+    <w:p>
+      <w:pPr>
+        <w:jc w:val="center"/>
+      </w:pPr>
+      <w:r>
+        <w:drawing>
+          <wp:inline distT="0" distB="0" distL="0" distR="0" wp14:anchorId="213A6115" wp14:editId="57AB1C9F">
+            <wp:extent cx="2237014" cy="1842430"/>
+            <wp:effectExtent l="0" t="0" r="0" b="5715"/>
+            <wp:docPr id="6" name="Picture 6"/>
+            <wp:cNvGraphicFramePr>
+              <a:graphicFrameLocks xmlns:a="http://schemas.openxmlformats.org/drawingml/2006/main" noChangeAspect="1"/>
+            </wp:cNvGraphicFramePr>
+            <a:graphic xmlns:a="http://schemas.openxmlformats.org/drawingml/2006/main">
+              <a:graphicData uri="http://schemas.openxmlformats.org/drawingml/2006/picture">
+                <pic:pic xmlns:pic="http://schemas.openxmlformats.org/drawingml/2006/picture">
+                  <pic:nvPicPr>
+                    <pic:cNvPr id="1" name=""/>
+                    <pic:cNvPicPr/>
+                  </pic:nvPicPr>
+                  <pic:blipFill>
+                    <a:blip r:embed="rId9"/>
+                    <a:stretch>
+                      <a:fillRect/>
+                    </a:stretch>
+                  </pic:blipFill>
+                  <pic:spPr>
+                    <a:xfrm>
+                      <a:off x="0" y="0"/>
+                      <a:ext cx="2249899" cy="1853042"/>
+                    </a:xfrm>
+                    <a:prstGeom prst="rect">
+                      <a:avLst/>
+                    </a:prstGeom>
+                  </pic:spPr>
+                </pic:pic>
+              </a:graphicData>
+            </a:graphic>
+          </wp:inline>
+        </w:drawing>
+      </w:r>
+    </w:p>
+    <w:p/>
+    <w:p>
+      <w:r>
+        <w:t xml:space="preserve">Finally, the five transmission lines are modeled using the data from Table 4. These data complete this DC-OPF model with reactance </w:t>
+      </w:r>
+      <w:r>
+        <w:t>xkl</w:t>
+      </w:r>
+      <w:r>
+        <w:t xml:space="preserve"> [p.u.], line capacity </w:t>
+      </w:r>
+      <w:r>
+        <w:t>Smax</w:t>
+      </w:r>
+      <w:r>
+        <w:t xml:space="preserve"> [MW], and base power </w:t>
+      </w:r>
+      <w:r>
+        <w:t>sb=100</w:t>
+      </w:r>
+      <w:r>
+        <w:t xml:space="preserve"> [MW].</w:t>
+      </w:r>
+    </w:p>
+    <w:p>
+      <w:r>
+        <w:t>These lines will allow each bus to share excess power or excess demand with other buses</w:t>
+      </w:r>
+    </w:p>
+    <w:p>
+      <w:pPr>
+        <w:pStyle w:val="Caption"/>
+        <w:keepNext/>
+        <w:jc w:val="center"/>
+      </w:pPr>
+      <w:r>
+        <w:t xml:space="preserve">Table </w:t>
+      </w:r>
+      <w:r>
+        <w:fldChar w:fldCharType="begin"/>
+      </w:r>
+      <w:r>
+        <w:instrText xml:space="preserve"> SEQ Table \* ARABIC </w:instrText>
+      </w:r>
+      <w:r>
+        <w:fldChar w:fldCharType="separate"/>
+      </w:r>
+      <w:r>
+        <w:rPr>
+          <w:noProof/>
+        </w:rPr>
+        <w:t>4</w:t>
+      </w:r>
+      <w:r>
+        <w:fldChar w:fldCharType="end"/>
+      </w:r>
+      <w:r>
+        <w:t>, Transmission lines Characteristics</w:t>
+      </w:r>
+    </w:p>
+    <w:p>
+      <w:pPr>
+        <w:ind w:firstLine="0"/>
+        <w:jc w:val="center"/>
+      </w:pPr>
+      <w:r>
+        <w:drawing>
+          <wp:inline distT="0" distB="0" distL="0" distR="0" wp14:anchorId="5A75F03A" wp14:editId="798DD38F">
+            <wp:extent cx="1248356" cy="919843"/>
+            <wp:effectExtent l="0" t="0" r="9525" b="0"/>
+            <wp:docPr id="7" name="Picture 7"/>
+            <wp:cNvGraphicFramePr>
+              <a:graphicFrameLocks xmlns:a="http://schemas.openxmlformats.org/drawingml/2006/main" noChangeAspect="1"/>
+            </wp:cNvGraphicFramePr>
+            <a:graphic xmlns:a="http://schemas.openxmlformats.org/drawingml/2006/main">
+              <a:graphicData uri="http://schemas.openxmlformats.org/drawingml/2006/picture">
+                <pic:pic xmlns:pic="http://schemas.openxmlformats.org/drawingml/2006/picture">
+                  <pic:nvPicPr>
+                    <pic:cNvPr id="1" name=""/>
+                    <pic:cNvPicPr/>
+                  </pic:nvPicPr>
+                  <pic:blipFill>
+                    <a:blip r:embed="rId10"/>
+                    <a:stretch>
+                      <a:fillRect/>
+                    </a:stretch>
+                  </pic:blipFill>
+                  <pic:spPr>
+                    <a:xfrm>
+                      <a:off x="0" y="0"/>
+                      <a:ext cx="1265628" cy="932570"/>
+                    </a:xfrm>
+                    <a:prstGeom prst="rect">
+                      <a:avLst/>
+                    </a:prstGeom>
+                  </pic:spPr>
+                </pic:pic>
+              </a:graphicData>
+            </a:graphic>
+          </wp:inline>
+        </w:drawing>
+      </w:r>
+    </w:p>
+    <w:p>
+      <w:pPr>
+        <w:pStyle w:val="Heading2"/>
+      </w:pPr>
+      <w:r>
+        <w:t xml:space="preserve">Presenting  </w:t>
+      </w:r>
+      <w:r>
+        <w:t>mathematical ecuations</w:t>
+      </w:r>
+      <w:r>
+        <w:t xml:space="preserve"> (</w:t>
+      </w:r>
+      <w:r>
+        <w:t>TC</w:t>
+      </w:r>
+      <w:r>
+        <w:t>MPA</w:t>
+      </w:r>
+      <w:r>
+        <w:t xml:space="preserve"> transmission constrained</w:t>
+      </w:r>
+      <w:r>
+        <w:t xml:space="preserve"> multiperiod auction equations)</w:t>
+      </w:r>
+    </w:p>
+    <w:p>
+      <w:r>
+        <w:t xml:space="preserve">The optimization objective is to maximize Social Welfare (SW) </w:t>
+      </w:r>
+      <w:r>
+        <w:t>within every node (bus)</w:t>
+      </w:r>
+      <w:r>
+        <w:t xml:space="preserve"> where all powers (generated or demanded) are positive variables</w:t>
+      </w:r>
+      <w:r>
+        <w:t>.</w:t>
+      </w:r>
+    </w:p>
+    <w:p>
+      <w:pPr>
+        <w:pStyle w:val="Caption"/>
+        <w:keepNext/>
+        <w:jc w:val="center"/>
+      </w:pPr>
+      <w:r>
+        <w:t xml:space="preserve">Equation </w:t>
+      </w:r>
+      <w:r>
+        <w:fldChar w:fldCharType="begin"/>
+      </w:r>
+      <w:r>
+        <w:instrText xml:space="preserve"> SEQ Equation \* ARABIC </w:instrText>
+      </w:r>
+      <w:r>
+        <w:fldChar w:fldCharType="separate"/>
+      </w:r>
+      <w:r>
+        <w:rPr>
+          <w:noProof/>
+        </w:rPr>
+        <w:t>1</w:t>
+      </w:r>
+      <w:r>
+        <w:fldChar w:fldCharType="end"/>
+      </w:r>
+      <w:r>
+        <w:t>, Social welfare maximization.</w:t>
+      </w:r>
+    </w:p>
+    <w:p>
+      <w:pPr>
+        <w:jc w:val="center"/>
+      </w:pPr>
+      <w:r>
+        <w:drawing>
+          <wp:inline distT="0" distB="0" distL="0" distR="0" wp14:anchorId="699CD76A" wp14:editId="6DB8FC9B">
+            <wp:extent cx="1285875" cy="955221"/>
+            <wp:effectExtent l="0" t="0" r="0" b="0"/>
+            <wp:docPr id="9" name="Picture 9"/>
+            <wp:cNvGraphicFramePr>
+              <a:graphicFrameLocks xmlns:a="http://schemas.openxmlformats.org/drawingml/2006/main" noChangeAspect="1"/>
+            </wp:cNvGraphicFramePr>
+            <a:graphic xmlns:a="http://schemas.openxmlformats.org/drawingml/2006/main">
+              <a:graphicData uri="http://schemas.openxmlformats.org/drawingml/2006/picture">
+                <pic:pic xmlns:pic="http://schemas.openxmlformats.org/drawingml/2006/picture">
+                  <pic:nvPicPr>
+                    <pic:cNvPr id="1" name=""/>
+                    <pic:cNvPicPr/>
+                  </pic:nvPicPr>
+                  <pic:blipFill>
+                    <a:blip r:embed="rId11"/>
+                    <a:stretch>
+                      <a:fillRect/>
+                    </a:stretch>
+                  </pic:blipFill>
+                  <pic:spPr>
+                    <a:xfrm>
+                      <a:off x="0" y="0"/>
+                      <a:ext cx="1294637" cy="961730"/>
+                    </a:xfrm>
+                    <a:prstGeom prst="rect">
+                      <a:avLst/>
+                    </a:prstGeom>
+                  </pic:spPr>
+                </pic:pic>
+              </a:graphicData>
+            </a:graphic>
+          </wp:inline>
+        </w:drawing>
+      </w:r>
+    </w:p>
+    <w:p>
+      <w:pPr>
+        <w:jc w:val="left"/>
+      </w:pPr>
+      <w:r>
+        <w:t>That SW is subject to the following rules Equation2</w:t>
+      </w:r>
+    </w:p>
+    <w:p>
+      <w:pPr>
+        <w:pStyle w:val="Caption"/>
+        <w:keepNext/>
+        <w:jc w:val="center"/>
+      </w:pPr>
+      <w:r>
+        <w:t xml:space="preserve">Equation </w:t>
+      </w:r>
+      <w:r>
+        <w:fldChar w:fldCharType="begin"/>
+      </w:r>
+      <w:r>
+        <w:instrText xml:space="preserve"> SEQ Equation \* ARABIC </w:instrText>
+      </w:r>
+      <w:r>
+        <w:fldChar w:fldCharType="separate"/>
+      </w:r>
+      <w:r>
+        <w:rPr>
+          <w:noProof/>
+        </w:rPr>
+        <w:t>2</w:t>
+      </w:r>
+      <w:r>
+        <w:fldChar w:fldCharType="end"/>
+      </w:r>
+      <w:r>
+        <w:t>, Matched generation and demand</w:t>
+      </w:r>
+    </w:p>
+    <w:p>
+      <w:pPr>
+        <w:jc w:val="center"/>
+      </w:pPr>
+      <w:r>
+        <w:drawing>
+          <wp:inline distT="0" distB="0" distL="0" distR="0" wp14:anchorId="315197A9" wp14:editId="5B38E823">
+            <wp:extent cx="1567542" cy="1103084"/>
+            <wp:effectExtent l="0" t="0" r="0" b="1905"/>
+            <wp:docPr id="10" name="Picture 10"/>
+            <wp:cNvGraphicFramePr>
+              <a:graphicFrameLocks xmlns:a="http://schemas.openxmlformats.org/drawingml/2006/main" noChangeAspect="1"/>
+            </wp:cNvGraphicFramePr>
+            <a:graphic xmlns:a="http://schemas.openxmlformats.org/drawingml/2006/main">
+              <a:graphicData uri="http://schemas.openxmlformats.org/drawingml/2006/picture">
+                <pic:pic xmlns:pic="http://schemas.openxmlformats.org/drawingml/2006/picture">
+                  <pic:nvPicPr>
+                    <pic:cNvPr id="1" name=""/>
+                    <pic:cNvPicPr/>
+                  </pic:nvPicPr>
+                  <pic:blipFill>
+                    <a:blip r:embed="rId12"/>
+                    <a:stretch>
+                      <a:fillRect/>
+                    </a:stretch>
+                  </pic:blipFill>
+                  <pic:spPr>
+                    <a:xfrm>
+                      <a:off x="0" y="0"/>
+                      <a:ext cx="1588502" cy="1117834"/>
+                    </a:xfrm>
+                    <a:prstGeom prst="rect">
+                      <a:avLst/>
+                    </a:prstGeom>
+                  </pic:spPr>
+                </pic:pic>
+              </a:graphicData>
+            </a:graphic>
+          </wp:inline>
+        </w:drawing>
+      </w:r>
+    </w:p>
+    <w:p>
+      <w:pPr>
+        <w:jc w:val="left"/>
+      </w:pPr>
+      <w:r>
+        <w:t>The generation ramp up/down limits are modeled with Equation</w:t>
+      </w:r>
+      <w:r>
+        <w:t>3</w:t>
+      </w:r>
+      <w:r>
+        <w:t>.</w:t>
+      </w:r>
+    </w:p>
+    <w:p>
+      <w:pPr>
+        <w:pStyle w:val="Caption"/>
+        <w:keepNext/>
+        <w:jc w:val="center"/>
+      </w:pPr>
+      <w:r>
+        <w:t xml:space="preserve">Equation </w:t>
+      </w:r>
+      <w:r>
+        <w:fldChar w:fldCharType="begin"/>
+      </w:r>
+      <w:r>
+        <w:instrText xml:space="preserve"> SEQ Equation \* ARABIC </w:instrText>
+      </w:r>
+      <w:r>
+        <w:fldChar w:fldCharType="separate"/>
+      </w:r>
+      <w:r>
+        <w:rPr>
+          <w:noProof/>
+        </w:rPr>
+        <w:t>3</w:t>
+      </w:r>
+      <w:r>
+        <w:fldChar w:fldCharType="end"/>
+      </w:r>
+    </w:p>
+    <w:p>
+      <w:pPr>
+        <w:jc w:val="center"/>
+      </w:pPr>
+      <w:r>
+        <w:drawing>
+          <wp:inline distT="0" distB="0" distL="0" distR="0" wp14:anchorId="18B458E2" wp14:editId="6D250CBC">
+            <wp:extent cx="1681843" cy="494660"/>
+            <wp:effectExtent l="0" t="0" r="0" b="1270"/>
+            <wp:docPr id="12" name="Picture 12"/>
+            <wp:cNvGraphicFramePr>
+              <a:graphicFrameLocks xmlns:a="http://schemas.openxmlformats.org/drawingml/2006/main" noChangeAspect="1"/>
+            </wp:cNvGraphicFramePr>
+            <a:graphic xmlns:a="http://schemas.openxmlformats.org/drawingml/2006/main">
+              <a:graphicData uri="http://schemas.openxmlformats.org/drawingml/2006/picture">
+                <pic:pic xmlns:pic="http://schemas.openxmlformats.org/drawingml/2006/picture">
+                  <pic:nvPicPr>
+                    <pic:cNvPr id="1" name=""/>
+                    <pic:cNvPicPr/>
+                  </pic:nvPicPr>
+                  <pic:blipFill>
+                    <a:blip r:embed="rId13"/>
+                    <a:stretch>
+                      <a:fillRect/>
+                    </a:stretch>
+                  </pic:blipFill>
+                  <pic:spPr>
+                    <a:xfrm>
+                      <a:off x="0" y="0"/>
+                      <a:ext cx="1729228" cy="508597"/>
+                    </a:xfrm>
+                    <a:prstGeom prst="rect">
+                      <a:avLst/>
+                    </a:prstGeom>
+                  </pic:spPr>
+                </pic:pic>
+              </a:graphicData>
+            </a:graphic>
+          </wp:inline>
+        </w:drawing>
+      </w:r>
+    </w:p>
+    <w:p>
+      <w:r>
+        <w:t>The generation maximum/minimum limits translate to equation</w:t>
+      </w:r>
+      <w:r>
+        <w:t>4</w:t>
+      </w:r>
+      <w:r>
+        <w:t>.</w:t>
+      </w:r>
+    </w:p>
+    <w:p>
+      <w:pPr>
+        <w:pStyle w:val="Caption"/>
+        <w:keepNext/>
+        <w:jc w:val="center"/>
+      </w:pPr>
+      <w:r>
+        <w:t xml:space="preserve">Equation </w:t>
+      </w:r>
+      <w:r>
+        <w:fldChar w:fldCharType="begin"/>
+      </w:r>
+      <w:r>
+        <w:instrText xml:space="preserve"> SEQ Equation \* ARABIC </w:instrText>
+      </w:r>
+      <w:r>
+        <w:fldChar w:fldCharType="separate"/>
+      </w:r>
+      <w:r>
+        <w:rPr>
+          <w:noProof/>
+        </w:rPr>
+        <w:t>4</w:t>
+      </w:r>
+      <w:r>
+        <w:fldChar w:fldCharType="end"/>
+      </w:r>
+    </w:p>
+    <w:p>
+      <w:pPr>
+        <w:jc w:val="center"/>
+      </w:pPr>
+      <w:r>
+        <w:drawing>
+          <wp:inline distT="0" distB="0" distL="0" distR="0" wp14:anchorId="03AFADA3" wp14:editId="004AD746">
+            <wp:extent cx="1360714" cy="475318"/>
+            <wp:effectExtent l="0" t="0" r="0" b="1270"/>
+            <wp:docPr id="13" name="Picture 13"/>
+            <wp:cNvGraphicFramePr>
+              <a:graphicFrameLocks xmlns:a="http://schemas.openxmlformats.org/drawingml/2006/main" noChangeAspect="1"/>
+            </wp:cNvGraphicFramePr>
+            <a:graphic xmlns:a="http://schemas.openxmlformats.org/drawingml/2006/main">
+              <a:graphicData uri="http://schemas.openxmlformats.org/drawingml/2006/picture">
+                <pic:pic xmlns:pic="http://schemas.openxmlformats.org/drawingml/2006/picture">
+                  <pic:nvPicPr>
+                    <pic:cNvPr id="1" name=""/>
+                    <pic:cNvPicPr/>
+                  </pic:nvPicPr>
+                  <pic:blipFill>
+                    <a:blip r:embed="rId14"/>
+                    <a:stretch>
+                      <a:fillRect/>
+                    </a:stretch>
+                  </pic:blipFill>
+                  <pic:spPr>
+                    <a:xfrm>
+                      <a:off x="0" y="0"/>
+                      <a:ext cx="1377338" cy="481125"/>
+                    </a:xfrm>
+                    <a:prstGeom prst="rect">
+                      <a:avLst/>
+                    </a:prstGeom>
+                  </pic:spPr>
+                </pic:pic>
+              </a:graphicData>
+            </a:graphic>
+          </wp:inline>
+        </w:drawing>
+      </w:r>
+    </w:p>
+    <w:p>
+      <w:pPr>
+        <w:jc w:val="left"/>
+      </w:pPr>
+      <w:r>
+        <w:t>As there is no energy storage modeled in our grid, the power generated must match the power consumed in every node Equation5 (+imports/exports)</w:t>
+      </w:r>
+      <w:r>
+        <w:t>.</w:t>
+      </w:r>
+    </w:p>
+    <w:p>
+      <w:pPr>
+        <w:jc w:val="center"/>
+      </w:pPr>
+    </w:p>
+    <w:p>
+      <w:pPr>
+        <w:pStyle w:val="Caption"/>
+        <w:keepNext/>
+        <w:ind w:firstLine="0"/>
+        <w:jc w:val="center"/>
+      </w:pPr>
+      <w:r>
+        <w:lastRenderedPageBreak/>
+        <w:t xml:space="preserve">Equation </w:t>
+      </w:r>
+      <w:r>
+        <w:fldChar w:fldCharType="begin"/>
+      </w:r>
+      <w:r>
+        <w:instrText xml:space="preserve"> SEQ Equation \* ARABIC </w:instrText>
+      </w:r>
+      <w:r>
+        <w:fldChar w:fldCharType="separate"/>
+      </w:r>
+      <w:r>
+        <w:rPr>
+          <w:noProof/>
+        </w:rPr>
+        <w:t>5</w:t>
+      </w:r>
+      <w:r>
+        <w:fldChar w:fldCharType="end"/>
+      </w:r>
+      <w:r>
+        <w:t>, Internodal market equilirbium</w:t>
+      </w:r>
+    </w:p>
+    <w:p>
+      <w:pPr>
+        <w:jc w:val="center"/>
+      </w:pPr>
+      <w:r>
+        <w:drawing>
+          <wp:inline distT="0" distB="0" distL="0" distR="0" wp14:anchorId="4A332B20" wp14:editId="39FCC9C7">
+            <wp:extent cx="1132114" cy="781892"/>
+            <wp:effectExtent l="0" t="0" r="0" b="0"/>
+            <wp:docPr id="14" name="Picture 14"/>
+            <wp:cNvGraphicFramePr>
+              <a:graphicFrameLocks xmlns:a="http://schemas.openxmlformats.org/drawingml/2006/main" noChangeAspect="1"/>
+            </wp:cNvGraphicFramePr>
+            <a:graphic xmlns:a="http://schemas.openxmlformats.org/drawingml/2006/main">
+              <a:graphicData uri="http://schemas.openxmlformats.org/drawingml/2006/picture">
+                <pic:pic xmlns:pic="http://schemas.openxmlformats.org/drawingml/2006/picture">
+                  <pic:nvPicPr>
+                    <pic:cNvPr id="1" name=""/>
+                    <pic:cNvPicPr/>
+                  </pic:nvPicPr>
+                  <pic:blipFill>
+                    <a:blip r:embed="rId15"/>
+                    <a:stretch>
+                      <a:fillRect/>
+                    </a:stretch>
+                  </pic:blipFill>
+                  <pic:spPr>
+                    <a:xfrm>
+                      <a:off x="0" y="0"/>
+                      <a:ext cx="1146689" cy="791958"/>
+                    </a:xfrm>
+                    <a:prstGeom prst="rect">
+                      <a:avLst/>
+                    </a:prstGeom>
+                  </pic:spPr>
+                </pic:pic>
+              </a:graphicData>
+            </a:graphic>
+          </wp:inline>
+        </w:drawing>
+      </w:r>
+    </w:p>
+    <w:p>
+      <w:pPr>
+        <w:jc w:val="left"/>
+      </w:pPr>
+      <w:r>
+        <w:t>In order to model the power flow trough transmission lines , active power flow relates to grid frequency differences Equation6.</w:t>
+      </w:r>
+    </w:p>
+    <w:p>
+      <w:pPr>
+        <w:pStyle w:val="Caption"/>
+        <w:keepNext/>
+        <w:jc w:val="center"/>
+      </w:pPr>
+      <w:r>
+        <w:t xml:space="preserve">Equation </w:t>
+      </w:r>
+      <w:r>
+        <w:fldChar w:fldCharType="begin"/>
+      </w:r>
+      <w:r>
+        <w:instrText xml:space="preserve"> SEQ Equation \* ARABIC </w:instrText>
+      </w:r>
+      <w:r>
+        <w:fldChar w:fldCharType="separate"/>
+      </w:r>
+      <w:r>
+        <w:rPr>
+          <w:noProof/>
+        </w:rPr>
+        <w:t>6</w:t>
+      </w:r>
+      <w:r>
+        <w:fldChar w:fldCharType="end"/>
+      </w:r>
+      <w:r>
+        <w:t>, line power flows</w:t>
+      </w:r>
+    </w:p>
+    <w:p>
+      <w:pPr>
+        <w:jc w:val="center"/>
+      </w:pPr>
+      <w:r>
+        <w:drawing>
+          <wp:inline distT="0" distB="0" distL="0" distR="0" wp14:anchorId="18C16503" wp14:editId="4D0E189B">
+            <wp:extent cx="1736272" cy="421089"/>
+            <wp:effectExtent l="0" t="0" r="0" b="0"/>
+            <wp:docPr id="15" name="Picture 15"/>
+            <wp:cNvGraphicFramePr>
+              <a:graphicFrameLocks xmlns:a="http://schemas.openxmlformats.org/drawingml/2006/main" noChangeAspect="1"/>
+            </wp:cNvGraphicFramePr>
+            <a:graphic xmlns:a="http://schemas.openxmlformats.org/drawingml/2006/main">
+              <a:graphicData uri="http://schemas.openxmlformats.org/drawingml/2006/picture">
+                <pic:pic xmlns:pic="http://schemas.openxmlformats.org/drawingml/2006/picture">
+                  <pic:nvPicPr>
+                    <pic:cNvPr id="1" name=""/>
+                    <pic:cNvPicPr/>
+                  </pic:nvPicPr>
+                  <pic:blipFill>
+                    <a:blip r:embed="rId16"/>
+                    <a:stretch>
+                      <a:fillRect/>
+                    </a:stretch>
+                  </pic:blipFill>
+                  <pic:spPr>
+                    <a:xfrm>
+                      <a:off x="0" y="0"/>
+                      <a:ext cx="1751098" cy="424685"/>
+                    </a:xfrm>
+                    <a:prstGeom prst="rect">
+                      <a:avLst/>
+                    </a:prstGeom>
+                  </pic:spPr>
+                </pic:pic>
+              </a:graphicData>
+            </a:graphic>
+          </wp:inline>
+        </w:drawing>
       </w:r>
     </w:p>
     <w:p>
       <w:pPr>
         <w:pStyle w:val="Heading1"/>
-        <w:rPr>
-          <w:rFonts w:eastAsia="MS Mincho"/>
-        </w:rPr>
-      </w:pPr>
-      <w:r>
-        <w:rPr>
-          <w:rFonts w:eastAsia="MS Mincho"/>
-        </w:rPr>
-        <w:t xml:space="preserve"> Introduction (</w:t>
-      </w:r>
-      <w:r>
-        <w:rPr>
-          <w:rFonts w:eastAsia="MS Mincho"/>
-          <w:i/>
-          <w:smallCaps w:val="0"/>
-        </w:rPr>
-        <w:t>Heading 1</w:t>
-      </w:r>
-      <w:r>
-        <w:rPr>
-          <w:rFonts w:eastAsia="MS Mincho"/>
-        </w:rPr>
-        <w:t>)</w:t>
-      </w:r>
-    </w:p>
-    <w:p>
-      <w:pPr>
-        <w:pStyle w:val="BodyText"/>
-      </w:pPr>
-      <w:r>
-        <w:t>This</w:t>
-      </w:r>
-      <w:r>
-        <w:t xml:space="preserve"> template, </w:t>
-      </w:r>
-      <w:r>
-        <w:t>modified</w:t>
-      </w:r>
-      <w:r>
-        <w:t xml:space="preserve"> in MS Word 200</w:t>
-      </w:r>
-      <w:r>
-        <w:t>7</w:t>
-      </w:r>
-      <w:r>
-        <w:t xml:space="preserve"> and saved as </w:t>
-      </w:r>
-      <w:r>
-        <w:t xml:space="preserve"> a </w:t>
+      </w:pPr>
+      <w:r>
+        <w:t>Numerical results</w:t>
       </w:r>
     </w:p>
     <w:p>
@@ -317,7 +1380,7 @@
         <w:pStyle w:val="Heading2"/>
       </w:pPr>
       <w:r>
-        <w:t>Brief description of the problem</w:t>
+        <w:t>Description of the computational test</w:t>
       </w:r>
     </w:p>
     <w:p>
@@ -325,7 +1388,7 @@
         <w:pStyle w:val="Heading2"/>
       </w:pPr>
       <w:r>
-        <w:t>Objectives of the study and main contributions</w:t>
+        <w:t>Results for the base case test</w:t>
       </w:r>
     </w:p>
     <w:p>
@@ -333,140 +1396,24 @@
         <w:pStyle w:val="Heading2"/>
       </w:pPr>
       <w:r>
-        <w:t>Structure of the report</w:t>
-      </w:r>
-    </w:p>
+        <w:t>Results for the case with the inclusion of the Wind turbine</w:t>
+      </w:r>
+    </w:p>
+    <w:p>
+      <w:pPr>
+        <w:pStyle w:val="Heading2"/>
+      </w:pPr>
+      <w:r>
+        <w:t>Analysis of the results</w:t>
+      </w:r>
+    </w:p>
+    <w:p/>
     <w:p>
       <w:pPr>
         <w:pStyle w:val="Heading1"/>
-        <w:rPr>
-          <w:rFonts w:eastAsia="MS Mincho"/>
-        </w:rPr>
-      </w:pPr>
-      <w:r>
-        <w:rPr>
-          <w:rFonts w:eastAsia="MS Mincho"/>
-        </w:rPr>
-        <w:t>DEscription of the problem and mathematical model</w:t>
-      </w:r>
-    </w:p>
-    <w:p>
-      <w:pPr>
-        <w:pStyle w:val="Heading1"/>
-        <w:spacing w:before="120"/>
-        <w:rPr>
-          <w:rFonts w:eastAsia="MS Mincho"/>
-        </w:rPr>
-      </w:pPr>
-      <w:r>
-        <w:rPr>
-          <w:rFonts w:eastAsia="MS Mincho"/>
-        </w:rPr>
-        <w:t>Numerical results</w:t>
-      </w:r>
-    </w:p>
-    <w:p>
-      <w:pPr>
-        <w:pStyle w:val="BodyText"/>
-      </w:pPr>
-      <w:r>
-        <w:t xml:space="preserve">After the text edit has been completed, the paper is ready for the template. Duplicate the template file by using the Save </w:t>
-      </w:r>
-    </w:p>
-    <w:p>
-      <w:pPr>
-        <w:pStyle w:val="Heading2"/>
-      </w:pPr>
-      <w:r>
-        <w:t>Description of the computational test</w:t>
-      </w:r>
-    </w:p>
-    <w:p>
-      <w:pPr>
-        <w:pStyle w:val="BodyText"/>
-        <w:rPr>
-          <w:i/>
-        </w:rPr>
-      </w:pPr>
-      <w:r>
-        <w:t xml:space="preserve">The </w:t>
-      </w:r>
-      <w:r>
-        <w:t>template</w:t>
-      </w:r>
-      <w:r>
-        <w:t xml:space="preserve"> is designed so that author affiliations are not repeated each time for multiple authors of the same affiliation. Please keep your affiliations as succinct as possible (for </w:t>
-      </w:r>
-    </w:p>
-    <w:p>
-      <w:pPr>
-        <w:pStyle w:val="Heading2"/>
-      </w:pPr>
-      <w:r>
-        <w:t>Results for the base case test</w:t>
-      </w:r>
-    </w:p>
-    <w:p>
-      <w:pPr>
-        <w:pStyle w:val="BodyText"/>
-      </w:pPr>
-      <w:r>
-        <w:t>Headings, or heads, are organizational devices that guide the reader through your paper. There are two types: component heads and text heads.</w:t>
-      </w:r>
-    </w:p>
-    <w:p>
-      <w:pPr>
-        <w:pStyle w:val="Heading2"/>
-      </w:pPr>
-      <w:r>
-        <w:t>Results for the case with the inclusion of the Wind turbine</w:t>
-      </w:r>
-    </w:p>
-    <w:p>
-      <w:pPr>
-        <w:pStyle w:val="Heading2"/>
-      </w:pPr>
-      <w:r>
-        <w:t>Analysis of the results</w:t>
-      </w:r>
-    </w:p>
-    <w:p/>
-    <w:p>
-      <w:pPr>
-        <w:pStyle w:val="Heading1"/>
-        <w:spacing w:before="120"/>
-        <w:rPr>
-          <w:rFonts w:eastAsia="MS Mincho"/>
-        </w:rPr>
-      </w:pPr>
-      <w:r>
-        <w:rPr>
-          <w:rFonts w:eastAsia="MS Mincho"/>
-        </w:rPr>
+      </w:pPr>
+      <w:r>
         <w:t>Conclusions</w:t>
-      </w:r>
-    </w:p>
-    <w:p>
-      <w:pPr>
-        <w:pStyle w:val="Heading3"/>
-      </w:pPr>
-      <w:r>
-        <w:t xml:space="preserve">Positioning Figures and Tables: </w:t>
-      </w:r>
-      <w:r>
-        <w:t xml:space="preserve">Place figures and they are cited in the text. Use the abbreviation </w:t>
-      </w:r>
-      <w:r>
-        <w:t>“</w:t>
-      </w:r>
-      <w:r>
-        <w:t>Fig. 1,</w:t>
-      </w:r>
-      <w:r>
-        <w:t>”</w:t>
-      </w:r>
-      <w:r>
-        <w:t xml:space="preserve"> even at the beginning of a sentence.</w:t>
       </w:r>
     </w:p>
     <w:p>
@@ -504,12 +1451,6 @@
         <w:gridCol w:w="900"/>
       </w:tblGrid>
       <w:tr>
-        <w:tblPrEx>
-          <w:tblCellMar>
-            <w:top w:w="0" w:type="dxa"/>
-            <w:bottom w:w="0" w:type="dxa"/>
-          </w:tblCellMar>
-        </w:tblPrEx>
         <w:trPr>
           <w:cantSplit/>
           <w:trHeight w:val="240"/>
@@ -548,12 +1489,6 @@
         </w:tc>
       </w:tr>
       <w:tr>
-        <w:tblPrEx>
-          <w:tblCellMar>
-            <w:top w:w="0" w:type="dxa"/>
-            <w:bottom w:w="0" w:type="dxa"/>
-          </w:tblCellMar>
-        </w:tblPrEx>
         <w:trPr>
           <w:cantSplit/>
           <w:trHeight w:val="240"/>
@@ -565,14 +1500,7 @@
             <w:tcW w:w="720" w:type="dxa"/>
             <w:vMerge/>
           </w:tcPr>
-          <w:p>
-            <w:pPr>
-              <w:rPr>
-                <w:sz w:val="16"/>
-                <w:szCs w:val="16"/>
-              </w:rPr>
-            </w:pPr>
-          </w:p>
+          <w:p/>
         </w:tc>
         <w:tc>
           <w:tcPr>
@@ -618,12 +1546,6 @@
         </w:tc>
       </w:tr>
       <w:tr>
-        <w:tblPrEx>
-          <w:tblCellMar>
-            <w:top w:w="0" w:type="dxa"/>
-            <w:bottom w:w="0" w:type="dxa"/>
-          </w:tblCellMar>
-        </w:tblPrEx>
         <w:trPr>
           <w:trHeight w:val="320"/>
           <w:jc w:val="center"/>
@@ -671,28 +1593,14 @@
             <w:tcW w:w="900" w:type="dxa"/>
             <w:vAlign w:val="center"/>
           </w:tcPr>
-          <w:p>
-            <w:pPr>
-              <w:rPr>
-                <w:sz w:val="16"/>
-                <w:szCs w:val="16"/>
-              </w:rPr>
-            </w:pPr>
-          </w:p>
+          <w:p/>
         </w:tc>
         <w:tc>
           <w:tcPr>
             <w:tcW w:w="900" w:type="dxa"/>
             <w:vAlign w:val="center"/>
           </w:tcPr>
-          <w:p>
-            <w:pPr>
-              <w:rPr>
-                <w:sz w:val="16"/>
-                <w:szCs w:val="16"/>
-              </w:rPr>
-            </w:pPr>
-          </w:p>
+          <w:p/>
         </w:tc>
       </w:tr>
     </w:tbl>
@@ -728,159 +1636,63 @@
     </w:p>
     <w:p>
       <w:pPr>
-        <w:pStyle w:val="figurecaption"/>
-        <w:rPr>
-          <w:rFonts w:eastAsia="MS Mincho"/>
-        </w:rPr>
-      </w:pPr>
-      <w:r>
-        <w:rPr>
-          <w:rFonts w:eastAsia="MS Mincho"/>
-        </w:rPr>
-        <w:t xml:space="preserve">Example of a figure caption. </w:t>
+        <w:pStyle w:val="Heading5"/>
+      </w:pPr>
+      <w:r>
+        <w:t>References</w:t>
+      </w:r>
+    </w:p>
+    <w:p/>
+    <w:p>
+      <w:pPr>
+        <w:pStyle w:val="references"/>
+        <w:rPr>
+          <w:rFonts w:eastAsia="MS Mincho"/>
+        </w:rPr>
+      </w:pPr>
+      <w:r>
+        <w:rPr>
+          <w:rFonts w:eastAsia="MS Mincho"/>
+        </w:rPr>
+        <w:t xml:space="preserve">G. Eason, B. Noble, and I.N. Sneddon, </w:t>
+      </w:r>
+      <w:r>
+        <w:rPr>
+          <w:rFonts w:eastAsia="MS Mincho"/>
+        </w:rPr>
+        <w:t>“</w:t>
+      </w:r>
+      <w:r>
+        <w:rPr>
+          <w:rFonts w:eastAsia="MS Mincho"/>
+        </w:rPr>
+        <w:t>On certain integrals of Lipschitz-Hankel type involving products of Bessel functions,</w:t>
+      </w:r>
+      <w:r>
+        <w:rPr>
+          <w:rFonts w:eastAsia="MS Mincho"/>
+        </w:rPr>
+        <w:t>”</w:t>
+      </w:r>
+      <w:r>
+        <w:rPr>
+          <w:rFonts w:eastAsia="MS Mincho"/>
+        </w:rPr>
+        <w:t xml:space="preserve"> Phil. Trans. Roy. Soc. London, vol. A247, pp. 529-551, April 1955. (</w:t>
       </w:r>
       <w:r>
         <w:rPr>
           <w:rFonts w:eastAsia="MS Mincho"/>
           <w:i/>
-          <w:iCs/>
-        </w:rPr>
-        <w:t>(figure caption)</w:t>
-      </w:r>
-    </w:p>
-    <w:p>
-      <w:pPr>
-        <w:pStyle w:val="Heading5"/>
-        <w:rPr>
-          <w:rFonts w:eastAsia="MS Mincho"/>
-        </w:rPr>
-      </w:pPr>
-      <w:r>
-        <w:rPr>
-          <w:rFonts w:eastAsia="MS Mincho"/>
-        </w:rPr>
-        <w:t>References</w:t>
-      </w:r>
-    </w:p>
-    <w:p>
-      <w:pPr>
-        <w:pStyle w:val="BodyText"/>
-      </w:pPr>
-      <w:r>
-        <w:t xml:space="preserve">The template will number citations consecutively within brackets [1]. The sentence punctuation follows the bracket [2]. Refer simply to </w:t>
-      </w:r>
-      <w:r>
-        <w:t>the reference number, as in [3]—</w:t>
-      </w:r>
-      <w:r>
-        <w:t xml:space="preserve">do not use </w:t>
-      </w:r>
-      <w:r>
-        <w:t>“</w:t>
-      </w:r>
-      <w:r>
-        <w:t>Ref. [3]</w:t>
-      </w:r>
-      <w:r>
-        <w:t>”</w:t>
-      </w:r>
-      <w:r>
-        <w:t xml:space="preserve"> or </w:t>
-      </w:r>
-      <w:r>
-        <w:t>“</w:t>
-      </w:r>
-      <w:r>
-        <w:t>reference [3]</w:t>
-      </w:r>
-      <w:r>
-        <w:t>”</w:t>
-      </w:r>
-      <w:r>
-        <w:t xml:space="preserve"> except at the beginning of a sentence: </w:t>
-      </w:r>
-      <w:r>
-        <w:t>“</w:t>
-      </w:r>
-      <w:r>
-        <w:t>Reference [3] was the first ...</w:t>
-      </w:r>
-      <w:r>
-        <w:t>”</w:t>
-      </w:r>
-    </w:p>
-    <w:p>
-      <w:pPr>
-        <w:pStyle w:val="BodyText"/>
-      </w:pPr>
-      <w:r>
-        <w:t>Number footnotes separately in superscripts. Place the actual footnote at the bottom of the column in which it was cited. Do not put footnotes in the reference list. Use letters for table footnotes.</w:t>
-      </w:r>
-    </w:p>
-    <w:p>
-      <w:pPr>
-        <w:pStyle w:val="BodyText"/>
-      </w:pPr>
-      <w:r>
-        <w:t>Unless there are six a</w:t>
-      </w:r>
-      <w:r>
-        <w:t>uthors or more give all authors’</w:t>
-      </w:r>
-      <w:r>
-        <w:t xml:space="preserve"> names; do not use </w:t>
-      </w:r>
-      <w:r>
-        <w:t>“</w:t>
-      </w:r>
-      <w:r>
-        <w:t>et al.</w:t>
-      </w:r>
-      <w:r>
-        <w:t>”</w:t>
-      </w:r>
-      <w:r>
-        <w:t xml:space="preserve">. Papers that have not been published, even if they have been submitted for publication, should be cited as </w:t>
-      </w:r>
-      <w:r>
-        <w:t>“</w:t>
-      </w:r>
-      <w:r>
-        <w:t>unpublished</w:t>
-      </w:r>
-      <w:r>
-        <w:t>”</w:t>
-      </w:r>
-      <w:r>
-        <w:t xml:space="preserve"> [4]. Papers that have been accepted for publication should be cited as </w:t>
-      </w:r>
-      <w:r>
-        <w:t>“</w:t>
-      </w:r>
-      <w:r>
-        <w:t>in press</w:t>
-      </w:r>
-      <w:r>
-        <w:t>”</w:t>
-      </w:r>
-      <w:r>
-        <w:t xml:space="preserve"> [5]. Capitalize only the first word in a paper title, except for proper nouns and element symbols.</w:t>
-      </w:r>
-    </w:p>
-    <w:p>
-      <w:pPr>
-        <w:pStyle w:val="BodyText"/>
-      </w:pPr>
-      <w:r>
-        <w:t>For papers published in translation journals, please give the English citation first, followed by the original foreign-language citation [6].</w:t>
-      </w:r>
-    </w:p>
-    <w:p>
-      <w:pPr>
-        <w:rPr>
-          <w:rFonts w:eastAsia="MS Mincho"/>
-        </w:rPr>
-      </w:pPr>
+        </w:rPr>
+        <w:t>references</w:t>
+      </w:r>
+      <w:r>
+        <w:rPr>
+          <w:rFonts w:eastAsia="MS Mincho"/>
+        </w:rPr>
+        <w:t>)</w:t>
+      </w:r>
     </w:p>
     <w:p>
       <w:pPr>
@@ -890,197 +1702,13 @@
         </w:rPr>
       </w:pPr>
       <w:r>
-        <mc:AlternateContent>
-          <mc:Choice Requires="wps">
-            <w:drawing>
-              <wp:anchor distT="0" distB="0" distL="114300" distR="114300" simplePos="0" relativeHeight="251657728" behindDoc="1" locked="0" layoutInCell="1" allowOverlap="1" wp14:anchorId="1F2024EC" wp14:editId="6737AC13">
-                <wp:simplePos x="0" y="0"/>
-                <wp:positionH relativeFrom="column">
-                  <wp:posOffset>-3419475</wp:posOffset>
-                </wp:positionH>
-                <wp:positionV relativeFrom="paragraph">
-                  <wp:posOffset>2145665</wp:posOffset>
-                </wp:positionV>
-                <wp:extent cx="3200400" cy="1143000"/>
-                <wp:effectExtent l="0" t="2540" r="635" b="0"/>
-                <wp:wrapTight wrapText="bothSides">
-                  <wp:wrapPolygon edited="0">
-                    <wp:start x="0" y="0"/>
-                    <wp:lineTo x="21600" y="0"/>
-                    <wp:lineTo x="21600" y="21600"/>
-                    <wp:lineTo x="0" y="21600"/>
-                    <wp:lineTo x="0" y="0"/>
-                  </wp:wrapPolygon>
-                </wp:wrapTight>
-                <wp:docPr id="1" name="Text Box 2"/>
-                <wp:cNvGraphicFramePr>
-                  <a:graphicFrameLocks xmlns:a="http://schemas.openxmlformats.org/drawingml/2006/main"/>
-                </wp:cNvGraphicFramePr>
-                <a:graphic xmlns:a="http://schemas.openxmlformats.org/drawingml/2006/main">
-                  <a:graphicData uri="http://schemas.microsoft.com/office/word/2010/wordprocessingShape">
-                    <wps:wsp>
-                      <wps:cNvSpPr txBox="1">
-                        <a:spLocks noChangeArrowheads="1"/>
-                      </wps:cNvSpPr>
-                      <wps:spPr bwMode="auto">
-                        <a:xfrm>
-                          <a:off x="0" y="0"/>
-                          <a:ext cx="3200400" cy="1143000"/>
-                        </a:xfrm>
-                        <a:prstGeom prst="rect">
-                          <a:avLst/>
-                        </a:prstGeom>
-                        <a:noFill/>
-                        <a:ln>
-                          <a:noFill/>
-                        </a:ln>
-                        <a:extLst>
-                          <a:ext uri="{909E8E84-426E-40DD-AFC4-6F175D3DCCD1}">
-                            <a14:hiddenFill xmlns:a14="http://schemas.microsoft.com/office/drawing/2010/main">
-                              <a:solidFill>
-                                <a:srgbClr val="FFFFFF"/>
-                              </a:solidFill>
-                            </a14:hiddenFill>
-                          </a:ext>
-                          <a:ext uri="{91240B29-F687-4F45-9708-019B960494DF}">
-                            <a14:hiddenLine xmlns:a14="http://schemas.microsoft.com/office/drawing/2010/main" w="9525">
-                              <a:solidFill>
-                                <a:srgbClr val="000000"/>
-                              </a:solidFill>
-                              <a:miter lim="800000"/>
-                              <a:headEnd/>
-                              <a:tailEnd/>
-                            </a14:hiddenLine>
-                          </a:ext>
-                        </a:extLst>
-                      </wps:spPr>
-                      <wps:txbx>
-                        <w:txbxContent>
-                          <w:p>
-                            <w:pPr>
-                              <w:pStyle w:val="BodyText"/>
-                            </w:pPr>
-                            <w:r>
-                              <w:t>We suggest that you use a text box to insert a graphic (which is ideally a 300 dpi resolution TIFF or EPS file with all fonts embedded) because this method is somewhat more stable than directly inserting a picture.</w:t>
-                            </w:r>
-                          </w:p>
-                          <w:p>
-                            <w:pPr>
-                              <w:pStyle w:val="BodyText"/>
-                            </w:pPr>
-                            <w:r>
-                              <w:t>To have non-visible rules on your frame, use the MSWord “Format” pull-down menu, select Text Box &gt; Colors and Lines to choose No Fill and No Line.</w:t>
-                            </w:r>
-                          </w:p>
-                        </w:txbxContent>
-                      </wps:txbx>
-                      <wps:bodyPr rot="0" vert="horz" wrap="square" lIns="91440" tIns="45720" rIns="91440" bIns="45720" anchor="t" anchorCtr="0" upright="1">
-                        <a:noAutofit/>
-                      </wps:bodyPr>
-                    </wps:wsp>
-                  </a:graphicData>
-                </a:graphic>
-                <wp14:sizeRelH relativeFrom="page">
-                  <wp14:pctWidth>0</wp14:pctWidth>
-                </wp14:sizeRelH>
-                <wp14:sizeRelV relativeFrom="page">
-                  <wp14:pctHeight>0</wp14:pctHeight>
-                </wp14:sizeRelV>
-              </wp:anchor>
-            </w:drawing>
-          </mc:Choice>
-          <mc:Fallback>
-            <w:pict>
-              <v:shapetype w14:anchorId="1F2024EC" id="_x0000_t202" coordsize="21600,21600" o:spt="202" path="m,l,21600r21600,l21600,xe">
-                <v:stroke joinstyle="miter"/>
-                <v:path gradientshapeok="t" o:connecttype="rect"/>
-              </v:shapetype>
-              <v:shape id="Text Box 2" o:spid="_x0000_s1026" type="#_x0000_t202" style="position:absolute;left:0;text-align:left;margin-left:-269.25pt;margin-top:168.95pt;width:252pt;height:90pt;z-index:-251658752;visibility:visible;mso-wrap-style:square;mso-width-percent:0;mso-height-percent:0;mso-wrap-distance-left:9pt;mso-wrap-distance-top:0;mso-wrap-distance-right:9pt;mso-wrap-distance-bottom:0;mso-position-horizontal:absolute;mso-position-horizontal-relative:text;mso-position-vertical:absolute;mso-position-vertical-relative:text;mso-width-percent:0;mso-height-percent:0;mso-width-relative:page;mso-height-relative:page;v-text-anchor:top" o:gfxdata="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" filled="f" stroked="f">
-                <v:textbox>
-                  <w:txbxContent>
-                    <w:p>
-                      <w:pPr>
-                        <w:pStyle w:val="BodyText"/>
-                      </w:pPr>
-                      <w:r>
-                        <w:t>We suggest that you use a text box to insert a graphic (which is ideally a 300 dpi resolution TIFF or EPS file with all fonts embedded) because this method is somewhat more stable than directly inserting a picture.</w:t>
-                      </w:r>
-                    </w:p>
-                    <w:p>
-                      <w:pPr>
-                        <w:pStyle w:val="BodyText"/>
-                      </w:pPr>
-                      <w:r>
-                        <w:t>To have non-visible rules on your frame, use the MSWord “Format” pull-down menu, select Text Box &gt; Colors and Lines to choose No Fill and No Line.</w:t>
-                      </w:r>
-                    </w:p>
-                  </w:txbxContent>
-                </v:textbox>
-                <w10:wrap type="tight"/>
-              </v:shape>
-            </w:pict>
-          </mc:Fallback>
-        </mc:AlternateContent>
-      </w:r>
-      <w:r>
-        <w:rPr>
-          <w:rFonts w:eastAsia="MS Mincho"/>
-        </w:rPr>
-        <w:t xml:space="preserve">G. Eason, B. Noble, and I.N. Sneddon, </w:t>
-      </w:r>
-      <w:r>
-        <w:rPr>
-          <w:rFonts w:eastAsia="MS Mincho"/>
-        </w:rPr>
-        <w:t>“</w:t>
-      </w:r>
-      <w:r>
-        <w:rPr>
-          <w:rFonts w:eastAsia="MS Mincho"/>
-        </w:rPr>
-        <w:t>On certain integrals of Lipschitz-Hankel type involving products of Bessel functions,</w:t>
-      </w:r>
-      <w:r>
-        <w:rPr>
-          <w:rFonts w:eastAsia="MS Mincho"/>
-        </w:rPr>
-        <w:t>”</w:t>
-      </w:r>
-      <w:r>
-        <w:rPr>
-          <w:rFonts w:eastAsia="MS Mincho"/>
-        </w:rPr>
-        <w:t xml:space="preserve"> Phil. Trans. Roy. Soc. London, vol. A247, pp. 529-551, April 1955. (</w:t>
-      </w:r>
-      <w:r>
-        <w:rPr>
-          <w:rFonts w:eastAsia="MS Mincho"/>
-          <w:i/>
-        </w:rPr>
-        <w:t>references</w:t>
-      </w:r>
-      <w:r>
-        <w:rPr>
-          <w:rFonts w:eastAsia="MS Mincho"/>
-        </w:rPr>
-        <w:t>)</w:t>
-      </w:r>
-    </w:p>
-    <w:p>
-      <w:pPr>
-        <w:pStyle w:val="references"/>
-        <w:rPr>
-          <w:rFonts w:eastAsia="MS Mincho"/>
-        </w:rPr>
-      </w:pPr>
-      <w:r>
         <w:rPr>
           <w:rFonts w:eastAsia="MS Mincho"/>
         </w:rPr>
         <w:t xml:space="preserve">J. Clerk Maxwell, A Treatise on Electricity and Magnetism, 3rd ed., vol. 2. </w:t>
       </w:r>
-      <w:smartTag w:uri="urn:schemas-microsoft-com:office:smarttags" w:element="place">
-        <w:smartTag w:uri="urn:schemas-microsoft-com:office:smarttags" w:element="City">
+      <w:smartTag w:uri="urn:schemas-microsoft-com:office:smarttags" w:element="City">
+        <w:smartTag w:uri="urn:schemas-microsoft-com:office:smarttags" w:element="place">
           <w:r>
             <w:rPr>
               <w:rFonts w:eastAsia="MS Mincho"/>
@@ -1133,8 +1761,8 @@
         </w:rPr>
         <w:t xml:space="preserve"> in Magnetism, vol. III, G.T. Rado and H. Suhl, Eds. </w:t>
       </w:r>
-      <w:smartTag w:uri="urn:schemas-microsoft-com:office:smarttags" w:element="place">
-        <w:smartTag w:uri="urn:schemas-microsoft-com:office:smarttags" w:element="State">
+      <w:smartTag w:uri="urn:schemas-microsoft-com:office:smarttags" w:element="State">
+        <w:smartTag w:uri="urn:schemas-microsoft-com:office:smarttags" w:element="place">
           <w:r>
             <w:rPr>
               <w:rFonts w:eastAsia="MS Mincho"/>
@@ -1237,7 +1865,6 @@
         <w:rPr>
           <w:rFonts w:eastAsia="MS Mincho"/>
         </w:rPr>
-        <w:lastRenderedPageBreak/>
         <w:t xml:space="preserve">Y. Yorozu, M. </w:t>
       </w:r>
       <w:r>
@@ -1278,8 +1905,8 @@
         </w:rPr>
         <w:t xml:space="preserve">, vol. 2, pp. 740-741, August 1987 [Digests 9th Annual Conf. Magnetics </w:t>
       </w:r>
-      <w:smartTag w:uri="urn:schemas-microsoft-com:office:smarttags" w:element="place">
-        <w:smartTag w:uri="urn:schemas-microsoft-com:office:smarttags" w:element="country-region">
+      <w:smartTag w:uri="urn:schemas-microsoft-com:office:smarttags" w:element="country-region">
+        <w:smartTag w:uri="urn:schemas-microsoft-com:office:smarttags" w:element="place">
           <w:r>
             <w:rPr>
               <w:rFonts w:eastAsia="MS Mincho"/>
@@ -1366,11 +1993,7 @@
         </w:sectPr>
       </w:pPr>
     </w:p>
-    <w:p>
-      <w:pPr>
-        <w:jc w:val="both"/>
-      </w:pPr>
-    </w:p>
+    <w:p/>
     <w:sectPr>
       <w:type w:val="continuous"/>
       <w:pgSz w:w="11909" w:h="16834" w:code="9"/>
@@ -1552,6 +2175,7 @@
         <w:strike w:val="0"/>
         <w:dstrike w:val="0"/>
         <w:vanish w:val="0"/>
+        <w:color w:val="000000"/>
         <w:sz w:val="16"/>
         <w:szCs w:val="16"/>
         <w:vertAlign w:val="superscript"/>
@@ -1563,11 +2187,6 @@
           <w14:prstDash w14:val="solid"/>
           <w14:bevel/>
         </w14:textOutline>
-        <w14:textFill>
-          <w14:solidFill>
-            <w14:srgbClr w14:val="000000"/>
-          </w14:solidFill>
-        </w14:textFill>
       </w:rPr>
     </w:lvl>
     <w:lvl w:ilvl="1" w:tplc="04090019">
@@ -1855,7 +2474,7 @@
   <w:abstractNum w:abstractNumId="4" w15:restartNumberingAfterBreak="0">
     <w:nsid w:val="4189603E"/>
     <w:multiLevelType w:val="multilevel"/>
-    <w:tmpl w:val="85907AB4"/>
+    <w:tmpl w:val="5B148B3C"/>
     <w:lvl w:ilvl="0">
       <w:start w:val="1"/>
       <w:numFmt w:val="upperRoman"/>
@@ -2799,12 +3418,18 @@
   <w:style w:type="paragraph" w:default="1" w:styleId="Normal">
     <w:name w:val="Normal"/>
     <w:qFormat/>
-    <w:rsid w:val="005B535B"/>
+    <w:rsid w:val="009A7743"/>
     <w:pPr>
-      <w:jc w:val="center"/>
+      <w:tabs>
+        <w:tab w:val="left" w:pos="288"/>
+      </w:tabs>
+      <w:spacing w:after="120" w:line="228" w:lineRule="auto"/>
+      <w:ind w:firstLine="288"/>
+      <w:jc w:val="both"/>
     </w:pPr>
     <w:rPr>
-      <w:rFonts w:ascii="Times New Roman" w:hAnsi="Times New Roman"/>
+      <w:rFonts w:ascii="Times New Roman" w:eastAsia="MS Mincho" w:hAnsi="Times New Roman"/>
+      <w:spacing w:val="-1"/>
     </w:rPr>
   </w:style>
   <w:style w:type="paragraph" w:styleId="Heading1">
@@ -2855,7 +3480,6 @@
       <w:outlineLvl w:val="1"/>
     </w:pPr>
     <w:rPr>
-      <w:rFonts w:eastAsia="MS Mincho"/>
       <w:i/>
       <w:iCs/>
       <w:noProof/>
@@ -2876,11 +3500,9 @@
       </w:numPr>
       <w:spacing w:line="240" w:lineRule="exact"/>
       <w:ind w:firstLine="288"/>
-      <w:jc w:val="both"/>
       <w:outlineLvl w:val="2"/>
     </w:pPr>
     <w:rPr>
-      <w:rFonts w:eastAsia="MS Mincho"/>
       <w:i/>
       <w:iCs/>
       <w:noProof/>
@@ -2904,11 +3526,9 @@
       </w:tabs>
       <w:spacing w:before="40" w:after="40"/>
       <w:ind w:firstLine="504"/>
-      <w:jc w:val="both"/>
       <w:outlineLvl w:val="3"/>
     </w:pPr>
     <w:rPr>
-      <w:rFonts w:eastAsia="MS Mincho"/>
       <w:i/>
       <w:iCs/>
       <w:noProof/>
@@ -2933,16 +3553,43 @@
       <w:noProof/>
     </w:rPr>
   </w:style>
+  <w:style w:type="paragraph" w:styleId="Heading6">
+    <w:name w:val="heading 6"/>
+    <w:basedOn w:val="Heading1"/>
+    <w:next w:val="Normal"/>
+    <w:link w:val="Heading6Char"/>
+    <w:uiPriority w:val="9"/>
+    <w:unhideWhenUsed/>
+    <w:qFormat/>
+    <w:rsid w:val="007E5C07"/>
+    <w:pPr>
+      <w:outlineLvl w:val="5"/>
+    </w:pPr>
+  </w:style>
+  <w:style w:type="paragraph" w:styleId="Heading7">
+    <w:name w:val="heading 7"/>
+    <w:basedOn w:val="Heading2"/>
+    <w:next w:val="Normal"/>
+    <w:link w:val="Heading7Char"/>
+    <w:uiPriority w:val="9"/>
+    <w:unhideWhenUsed/>
+    <w:qFormat/>
+    <w:rsid w:val="007E5C07"/>
+    <w:pPr>
+      <w:outlineLvl w:val="6"/>
+    </w:pPr>
+  </w:style>
   <w:style w:type="character" w:default="1" w:styleId="DefaultParagraphFont">
     <w:name w:val="Default Paragraph Font"/>
-    <w:uiPriority w:val="99"/>
+    <w:uiPriority w:val="1"/>
+    <w:semiHidden/>
+    <w:unhideWhenUsed/>
   </w:style>
   <w:style w:type="table" w:default="1" w:styleId="TableNormal">
     <w:name w:val="Normal Table"/>
     <w:uiPriority w:val="99"/>
     <w:semiHidden/>
     <w:unhideWhenUsed/>
-    <w:qFormat/>
     <w:tblPr>
       <w:tblInd w:w="0" w:type="dxa"/>
       <w:tblCellMar>
@@ -3081,18 +3728,6 @@
     <w:link w:val="BodyTextChar"/>
     <w:uiPriority w:val="99"/>
     <w:rsid w:val="00753F7B"/>
-    <w:pPr>
-      <w:tabs>
-        <w:tab w:val="left" w:pos="288"/>
-      </w:tabs>
-      <w:spacing w:after="120" w:line="228" w:lineRule="auto"/>
-      <w:ind w:firstLine="288"/>
-      <w:jc w:val="both"/>
-    </w:pPr>
-    <w:rPr>
-      <w:rFonts w:eastAsia="MS Mincho"/>
-      <w:spacing w:val="-1"/>
-    </w:rPr>
   </w:style>
   <w:style w:type="character" w:customStyle="1" w:styleId="BodyTextChar">
     <w:name w:val="Body Text Char"/>
@@ -3330,6 +3965,112 @@
       <w:noProof/>
       <w:sz w:val="16"/>
       <w:szCs w:val="16"/>
+    </w:rPr>
+  </w:style>
+  <w:style w:type="paragraph" w:styleId="Caption">
+    <w:name w:val="caption"/>
+    <w:basedOn w:val="Normal"/>
+    <w:next w:val="Normal"/>
+    <w:uiPriority w:val="35"/>
+    <w:unhideWhenUsed/>
+    <w:qFormat/>
+    <w:rsid w:val="00280165"/>
+    <w:pPr>
+      <w:spacing w:after="200"/>
+    </w:pPr>
+    <w:rPr>
+      <w:i/>
+      <w:iCs/>
+      <w:color w:val="44546A" w:themeColor="text2"/>
+      <w:sz w:val="18"/>
+      <w:szCs w:val="18"/>
+    </w:rPr>
+  </w:style>
+  <w:style w:type="paragraph" w:styleId="Title">
+    <w:name w:val="Title"/>
+    <w:basedOn w:val="papertitle"/>
+    <w:next w:val="Normal"/>
+    <w:link w:val="TitleChar"/>
+    <w:uiPriority w:val="10"/>
+    <w:qFormat/>
+    <w:rsid w:val="007E5C07"/>
+    <w:rPr>
+      <w:b/>
+      <w:bCs w:val="0"/>
+    </w:rPr>
+  </w:style>
+  <w:style w:type="character" w:customStyle="1" w:styleId="TitleChar">
+    <w:name w:val="Title Char"/>
+    <w:basedOn w:val="DefaultParagraphFont"/>
+    <w:link w:val="Title"/>
+    <w:uiPriority w:val="10"/>
+    <w:rsid w:val="007E5C07"/>
+    <w:rPr>
+      <w:rFonts w:ascii="Times New Roman" w:hAnsi="Times New Roman"/>
+      <w:b/>
+      <w:noProof/>
+      <w:sz w:val="48"/>
+      <w:szCs w:val="48"/>
+    </w:rPr>
+  </w:style>
+  <w:style w:type="paragraph" w:styleId="Subtitle">
+    <w:name w:val="Subtitle"/>
+    <w:basedOn w:val="Normal"/>
+    <w:next w:val="Normal"/>
+    <w:link w:val="SubtitleChar"/>
+    <w:uiPriority w:val="11"/>
+    <w:qFormat/>
+    <w:rsid w:val="007E5C07"/>
+    <w:pPr>
+      <w:jc w:val="center"/>
+    </w:pPr>
+  </w:style>
+  <w:style w:type="character" w:customStyle="1" w:styleId="SubtitleChar">
+    <w:name w:val="Subtitle Char"/>
+    <w:basedOn w:val="DefaultParagraphFont"/>
+    <w:link w:val="Subtitle"/>
+    <w:uiPriority w:val="11"/>
+    <w:rsid w:val="007E5C07"/>
+    <w:rPr>
+      <w:rFonts w:ascii="Times New Roman" w:eastAsia="MS Mincho" w:hAnsi="Times New Roman"/>
+      <w:spacing w:val="-1"/>
+    </w:rPr>
+  </w:style>
+  <w:style w:type="character" w:customStyle="1" w:styleId="Heading6Char">
+    <w:name w:val="Heading 6 Char"/>
+    <w:basedOn w:val="DefaultParagraphFont"/>
+    <w:link w:val="Heading6"/>
+    <w:uiPriority w:val="9"/>
+    <w:rsid w:val="007E5C07"/>
+    <w:rPr>
+      <w:rFonts w:ascii="Times New Roman" w:eastAsia="MS Mincho" w:hAnsi="Times New Roman"/>
+      <w:smallCaps/>
+      <w:noProof/>
+      <w:spacing w:val="-1"/>
+    </w:rPr>
+  </w:style>
+  <w:style w:type="character" w:customStyle="1" w:styleId="Heading7Char">
+    <w:name w:val="Heading 7 Char"/>
+    <w:basedOn w:val="DefaultParagraphFont"/>
+    <w:link w:val="Heading7"/>
+    <w:uiPriority w:val="9"/>
+    <w:rsid w:val="007E5C07"/>
+    <w:rPr>
+      <w:rFonts w:ascii="Times New Roman" w:eastAsia="MS Mincho" w:hAnsi="Times New Roman"/>
+      <w:i/>
+      <w:iCs/>
+      <w:noProof/>
+      <w:spacing w:val="-1"/>
+    </w:rPr>
+  </w:style>
+  <w:style w:type="character" w:styleId="PlaceholderText">
+    <w:name w:val="Placeholder Text"/>
+    <w:basedOn w:val="DefaultParagraphFont"/>
+    <w:uiPriority w:val="99"/>
+    <w:semiHidden/>
+    <w:rsid w:val="00BE357D"/>
+    <w:rPr>
+      <w:color w:val="808080"/>
     </w:rPr>
   </w:style>
 </w:styles>
@@ -3628,4 +4369,16 @@
     </a:ext>
   </a:extLst>
 </a:theme>
+</file>
+
+<file path=customXml/item1.xml><?xml version="1.0" encoding="utf-8"?>
+<b:Sources xmlns:b="http://schemas.openxmlformats.org/officeDocument/2006/bibliography" xmlns="http://schemas.openxmlformats.org/officeDocument/2006/bibliography" SelectedStyle="\IEEE2006OfficeOnline.xsl" StyleName="IEEE" Version="2006"/>
+</file>
+
+<file path=customXml/itemProps1.xml><?xml version="1.0" encoding="utf-8"?>
+<ds:datastoreItem xmlns:ds="http://schemas.openxmlformats.org/officeDocument/2006/customXml" ds:itemID="{8E2110D7-DE12-4C0C-97E6-9702462B5A6A}">
+  <ds:schemaRefs>
+    <ds:schemaRef ds:uri="http://schemas.openxmlformats.org/officeDocument/2006/bibliography"/>
+  </ds:schemaRefs>
+</ds:datastoreItem>
 </file>
</xml_diff>